<commit_message>
cover letter and cv ui updated edit and save function error solved
</commit_message>
<xml_diff>
--- a/backend/CareerPilot_Generated_CV.docx
+++ b/backend/CareerPilot_Generated_CV.docx
@@ -2,10 +2,17 @@
 <file path=word/document.xml><?xml version="1.0" encoding="utf-8"?>
 <w:document xmlns:w="http://schemas.openxmlformats.org/wordprocessingml/2006/main" xmlns:m="http://schemas.openxmlformats.org/officeDocument/2006/math" xmlns:r="http://schemas.openxmlformats.org/officeDocument/2006/relationships" xmlns:o="urn:schemas-microsoft-com:office:office" xmlns:v="urn:schemas-microsoft-com:vml" xmlns:w10="urn:schemas-microsoft-com:office:word" xmlns:a="http://schemas.openxmlformats.org/drawingml/2006/main" xmlns:pic="http://schemas.openxmlformats.org/drawingml/2006/picture" xmlns:wp="http://schemas.openxmlformats.org/drawingml/2006/wordprocessingDrawing">
   <w:body>
-    <w:bookmarkStart w:id="21" w:name="vikash-lama"/>
-    <w:p>
-      <w:pPr>
-        <w:pStyle w:val="Heading1"/>
+    <w:p>
+      <w:pPr>
+        <w:pStyle w:val="Title"/>
+      </w:pPr>
+      <w:r>
+        <w:t xml:space="preserve">VIKASH LAMA - Resume</w:t>
+      </w:r>
+    </w:p>
+    <w:p>
+      <w:pPr>
+        <w:pStyle w:val="FirstParagraph"/>
       </w:pPr>
       <w:r>
         <w:t xml:space="preserve">VIKASH LAMA</w:t>
@@ -13,111 +20,10 @@
     </w:p>
     <w:p>
       <w:pPr>
-        <w:pStyle w:val="FirstParagraph"/>
-      </w:pPr>
-      <w:r>
-        <w:t xml:space="preserve">+91-98765-43210 |</w:t>
-      </w:r>
-      <w:r>
-        <w:t xml:space="preserve"> </w:t>
-      </w:r>
-      <w:hyperlink r:id="rId9">
-        <w:r>
-          <w:rPr>
-            <w:rStyle w:val="Hyperlink"/>
-          </w:rPr>
-          <w:t xml:space="preserve">vikash.lama@example.com</w:t>
-        </w:r>
-      </w:hyperlink>
-      <w:r>
-        <w:t xml:space="preserve"> </w:t>
-      </w:r>
-      <w:r>
-        <w:t xml:space="preserve">| New Delhi, India</w:t>
-      </w:r>
-      <w:r>
-        <w:br/>
-      </w:r>
-      <w:r>
-        <w:t xml:space="preserve">LinkedIn:</w:t>
-      </w:r>
-      <w:r>
-        <w:t xml:space="preserve"> </w:t>
-      </w:r>
-      <w:hyperlink r:id="rId10">
-        <w:r>
-          <w:rPr>
-            <w:rStyle w:val="Hyperlink"/>
-          </w:rPr>
-          <w:t xml:space="preserve">linkedin.com/in/vikashlama</w:t>
-        </w:r>
-      </w:hyperlink>
-      <w:r>
-        <w:t xml:space="preserve"> </w:t>
-      </w:r>
-      <w:r>
-        <w:t xml:space="preserve">| GitHub:</w:t>
-      </w:r>
-      <w:r>
-        <w:t xml:space="preserve"> </w:t>
-      </w:r>
-      <w:hyperlink r:id="rId11">
-        <w:r>
-          <w:rPr>
-            <w:rStyle w:val="Hyperlink"/>
-          </w:rPr>
-          <w:t xml:space="preserve">github.com/vikashlama</w:t>
-        </w:r>
-      </w:hyperlink>
-    </w:p>
-    <w:p>
-      <w:r>
-        <w:pict>
-          <v:rect style="width:0;height:1.5pt" o:hralign="center" o:hrstd="t" o:hr="t"/>
-        </w:pict>
-      </w:r>
-    </w:p>
-    <w:bookmarkStart w:id="12" w:name="career-objective"/>
-    <w:p>
-      <w:pPr>
-        <w:pStyle w:val="Heading2"/>
-      </w:pPr>
-      <w:r>
-        <w:t xml:space="preserve">CAREER OBJECTIVE</w:t>
-      </w:r>
-    </w:p>
-    <w:p>
-      <w:pPr>
-        <w:pStyle w:val="FirstParagraph"/>
-      </w:pPr>
-      <w:r>
-        <w:t xml:space="preserve">Enthusiastic and dedicated professional seeking an opportunity to apply technical knowledge and strong problem-solving skills in a dynamic organization. Committed to continuous learning, contributing to team success, and taking initiative in leadership roles.</w:t>
-      </w:r>
-    </w:p>
-    <w:bookmarkEnd w:id="12"/>
-    <w:bookmarkStart w:id="13" w:name="education"/>
-    <w:p>
-      <w:pPr>
-        <w:pStyle w:val="Heading2"/>
-      </w:pPr>
-      <w:r>
-        <w:t xml:space="preserve">EDUCATION</w:t>
-      </w:r>
-    </w:p>
-    <w:p>
-      <w:pPr>
-        <w:pStyle w:val="FirstParagraph"/>
-      </w:pPr>
-      <w:r>
-        <w:t xml:space="preserve">Bachelor of Technology (B.Tech) – Computer Science</w:t>
-      </w:r>
-    </w:p>
-    <w:p>
-      <w:pPr>
         <w:pStyle w:val="BodyText"/>
       </w:pPr>
       <w:r>
-        <w:t xml:space="preserve">2019 – 2023</w:t>
+        <w:t xml:space="preserve">San Francisco, CA | (123) 456-7890 | vk@gmail.com</w:t>
       </w:r>
     </w:p>
     <w:p>
@@ -125,17 +31,59 @@
         <w:pStyle w:val="BodyText"/>
       </w:pPr>
       <w:r>
-        <w:t xml:space="preserve">XYZ University, Dehradun</w:t>
-      </w:r>
-    </w:p>
-    <w:bookmarkEnd w:id="13"/>
-    <w:bookmarkStart w:id="14" w:name="skills"/>
-    <w:p>
-      <w:pPr>
-        <w:pStyle w:val="Heading2"/>
-      </w:pPr>
-      <w:r>
-        <w:t xml:space="preserve">SKILLS</w:t>
+        <w:t xml:space="preserve">SUMMARY</w:t>
+      </w:r>
+    </w:p>
+    <w:p>
+      <w:pPr>
+        <w:pStyle w:val="BodyText"/>
+      </w:pPr>
+      <w:r>
+        <w:t xml:space="preserve">Highly motivated and results-driven Python Developer with extensive experience in designing, developing, and deploying robust and scalable applications. Proficient in full-stack development, database management, and cloud platforms, with a strong commitment to clean code and agile methodologies. Adept at transforming complex requirements into efficient, high-performance software solutions.</w:t>
+      </w:r>
+    </w:p>
+    <w:p>
+      <w:pPr>
+        <w:pStyle w:val="BodyText"/>
+      </w:pPr>
+      <w:r>
+        <w:t xml:space="preserve">Additional: Dedicated to continuous learning and leveraging cutting-edge technologies to drive innovation and deliver impactful technical solutions that exceed organizational objectives.</w:t>
+      </w:r>
+    </w:p>
+    <w:p>
+      <w:pPr>
+        <w:pStyle w:val="BodyText"/>
+      </w:pPr>
+      <w:r>
+        <w:t xml:space="preserve">EXPERIENCE</w:t>
+      </w:r>
+    </w:p>
+    <w:p>
+      <w:pPr>
+        <w:pStyle w:val="BodyText"/>
+      </w:pPr>
+      <w:r>
+        <w:t xml:space="preserve">Tech Solutions Inc.</w:t>
+      </w:r>
+      <w:r>
+        <w:t xml:space="preserve"> </w:t>
+      </w:r>
+      <w:r>
+        <w:t xml:space="preserve">San Francisco, CA</w:t>
+      </w:r>
+    </w:p>
+    <w:p>
+      <w:pPr>
+        <w:pStyle w:val="BodyText"/>
+      </w:pPr>
+      <w:r>
+        <w:t xml:space="preserve">Senior Python Developer</w:t>
+      </w:r>
+      <w:r>
+        <w:t xml:space="preserve"> </w:t>
+      </w:r>
+      <w:r>
+        <w:t xml:space="preserve">2020 – Present</w:t>
       </w:r>
     </w:p>
     <w:p>
@@ -147,17 +95,13 @@
         </w:numPr>
       </w:pPr>
       <w:r>
-        <w:rPr>
-          <w:b/>
-          <w:bCs/>
-        </w:rPr>
-        <w:t xml:space="preserve">Languages:</w:t>
-      </w:r>
-      <w:r>
-        <w:t xml:space="preserve"> </w:t>
-      </w:r>
-      <w:r>
-        <w:t xml:space="preserve">Java, Python, JavaScript</w:t>
+        <w:t xml:space="preserve">Backend Development:</w:t>
+      </w:r>
+      <w:r>
+        <w:t xml:space="preserve"> </w:t>
+      </w:r>
+      <w:r>
+        <w:t xml:space="preserve">Spearheaded the design and implementation of scalable RESTful APIs using Django and FastAPI, improving system performance by 25% and supporting significant user growth.</w:t>
       </w:r>
     </w:p>
     <w:p>
@@ -169,17 +113,13 @@
         </w:numPr>
       </w:pPr>
       <w:r>
-        <w:rPr>
-          <w:b/>
-          <w:bCs/>
-        </w:rPr>
-        <w:t xml:space="preserve">Web Development:</w:t>
-      </w:r>
-      <w:r>
-        <w:t xml:space="preserve"> </w:t>
-      </w:r>
-      <w:r>
-        <w:t xml:space="preserve">HTML5, CSS3, React.js, Node.js</w:t>
+        <w:t xml:space="preserve">Database Management:</w:t>
+      </w:r>
+      <w:r>
+        <w:t xml:space="preserve"> </w:t>
+      </w:r>
+      <w:r>
+        <w:t xml:space="preserve">Engineered and optimized complex database schemas in PostgreSQL, resulting in a 15% reduction in query times and enhanced data integrity.</w:t>
       </w:r>
     </w:p>
     <w:p>
@@ -191,17 +131,13 @@
         </w:numPr>
       </w:pPr>
       <w:r>
-        <w:rPr>
-          <w:b/>
-          <w:bCs/>
-        </w:rPr>
-        <w:t xml:space="preserve">Database:</w:t>
-      </w:r>
-      <w:r>
-        <w:t xml:space="preserve"> </w:t>
-      </w:r>
-      <w:r>
-        <w:t xml:space="preserve">MySQL, MongoDB</w:t>
+        <w:t xml:space="preserve">CI/CD &amp; Automation:</w:t>
+      </w:r>
+      <w:r>
+        <w:t xml:space="preserve"> </w:t>
+      </w:r>
+      <w:r>
+        <w:t xml:space="preserve">Established robust CI/CD pipelines with Docker and Kubernetes, alongside automated testing using Pytest, reducing deployment cycles by 40%.</w:t>
       </w:r>
     </w:p>
     <w:p>
@@ -213,58 +149,41 @@
         </w:numPr>
       </w:pPr>
       <w:r>
-        <w:rPr>
-          <w:b/>
-          <w:bCs/>
-        </w:rPr>
-        <w:t xml:space="preserve">Tools:</w:t>
-      </w:r>
-      <w:r>
-        <w:t xml:space="preserve"> </w:t>
-      </w:r>
-      <w:r>
-        <w:t xml:space="preserve">GitHub, VS Code, Postman</w:t>
-      </w:r>
-    </w:p>
-    <w:p>
-      <w:pPr>
-        <w:pStyle w:val="Compact"/>
-        <w:numPr>
-          <w:ilvl w:val="0"/>
-          <w:numId w:val="1001"/>
-        </w:numPr>
-      </w:pPr>
-      <w:r>
-        <w:rPr>
-          <w:b/>
-          <w:bCs/>
-        </w:rPr>
-        <w:t xml:space="preserve">Soft Skills:</w:t>
-      </w:r>
-      <w:r>
-        <w:t xml:space="preserve"> </w:t>
-      </w:r>
-      <w:r>
-        <w:t xml:space="preserve">Communication, Team Collaboration, Time Management, Leadership</w:t>
-      </w:r>
-    </w:p>
-    <w:bookmarkEnd w:id="14"/>
-    <w:bookmarkStart w:id="17" w:name="projects"/>
-    <w:p>
-      <w:pPr>
-        <w:pStyle w:val="Heading2"/>
-      </w:pPr>
-      <w:r>
-        <w:t xml:space="preserve">PROJECTS</w:t>
-      </w:r>
-    </w:p>
-    <w:bookmarkStart w:id="15" w:name="real-time-chat-application"/>
-    <w:p>
-      <w:pPr>
-        <w:pStyle w:val="Heading3"/>
-      </w:pPr>
-      <w:r>
-        <w:t xml:space="preserve">Real-Time Chat Application</w:t>
+        <w:t xml:space="preserve">Cloud Infrastructure:</w:t>
+      </w:r>
+      <w:r>
+        <w:t xml:space="preserve"> </w:t>
+      </w:r>
+      <w:r>
+        <w:t xml:space="preserve">Managed and deployed Python applications on AWS, ensuring high availability, security, and cost efficiency.</w:t>
+      </w:r>
+    </w:p>
+    <w:p>
+      <w:pPr>
+        <w:pStyle w:val="FirstParagraph"/>
+      </w:pPr>
+      <w:r>
+        <w:t xml:space="preserve">Innovate Software</w:t>
+      </w:r>
+      <w:r>
+        <w:t xml:space="preserve"> </w:t>
+      </w:r>
+      <w:r>
+        <w:t xml:space="preserve">San Jose, CA</w:t>
+      </w:r>
+    </w:p>
+    <w:p>
+      <w:pPr>
+        <w:pStyle w:val="BodyText"/>
+      </w:pPr>
+      <w:r>
+        <w:t xml:space="preserve">Python Developer</w:t>
+      </w:r>
+      <w:r>
+        <w:t xml:space="preserve"> </w:t>
+      </w:r>
+      <w:r>
+        <w:t xml:space="preserve">2017 – 2020</w:t>
       </w:r>
     </w:p>
     <w:p>
@@ -276,7 +195,13 @@
         </w:numPr>
       </w:pPr>
       <w:r>
-        <w:t xml:space="preserve">Developed a MERN stack chat app with user authentication, demonstrating robust problem-solving in complex system integration.</w:t>
+        <w:t xml:space="preserve">Feature Development:</w:t>
+      </w:r>
+      <w:r>
+        <w:t xml:space="preserve"> </w:t>
+      </w:r>
+      <w:r>
+        <w:t xml:space="preserve">Contributed to the full development lifecycle of Python-based applications, deploying new features weekly and enhancing user experience.</w:t>
       </w:r>
     </w:p>
     <w:p>
@@ -288,17 +213,59 @@
         </w:numPr>
       </w:pPr>
       <w:r>
-        <w:t xml:space="preserve">Integrated chatbot and video calling features, enhancing user experience through innovative solutions.</w:t>
-      </w:r>
-    </w:p>
-    <w:bookmarkEnd w:id="15"/>
-    <w:bookmarkStart w:id="16" w:name="photography-portfolio-website"/>
-    <w:p>
-      <w:pPr>
-        <w:pStyle w:val="Heading3"/>
-      </w:pPr>
-      <w:r>
-        <w:t xml:space="preserve">Photography Portfolio Website</w:t>
+        <w:t xml:space="preserve">Scripting &amp; Automation:</w:t>
+      </w:r>
+      <w:r>
+        <w:t xml:space="preserve"> </w:t>
+      </w:r>
+      <w:r>
+        <w:t xml:space="preserve">Developed and maintained Python scripts for automating data processing and reporting, saving over 10 hours of manual effort per week.</w:t>
+      </w:r>
+    </w:p>
+    <w:p>
+      <w:pPr>
+        <w:pStyle w:val="Compact"/>
+        <w:numPr>
+          <w:ilvl w:val="0"/>
+          <w:numId w:val="1002"/>
+        </w:numPr>
+      </w:pPr>
+      <w:r>
+        <w:t xml:space="preserve">Collaboration:</w:t>
+      </w:r>
+      <w:r>
+        <w:t xml:space="preserve"> </w:t>
+      </w:r>
+      <w:r>
+        <w:t xml:space="preserve">Collaborated effectively with cross-functional teams including product managers and QA engineers to define project requirements and deliver robust solutions.</w:t>
+      </w:r>
+    </w:p>
+    <w:p>
+      <w:pPr>
+        <w:pStyle w:val="FirstParagraph"/>
+      </w:pPr>
+      <w:r>
+        <w:t xml:space="preserve">Startup X</w:t>
+      </w:r>
+      <w:r>
+        <w:t xml:space="preserve"> </w:t>
+      </w:r>
+      <w:r>
+        <w:t xml:space="preserve">Mountain View, CA</w:t>
+      </w:r>
+    </w:p>
+    <w:p>
+      <w:pPr>
+        <w:pStyle w:val="BodyText"/>
+      </w:pPr>
+      <w:r>
+        <w:t xml:space="preserve">Junior Software Engineer</w:t>
+      </w:r>
+      <w:r>
+        <w:t xml:space="preserve"> </w:t>
+      </w:r>
+      <w:r>
+        <w:t xml:space="preserve">2015 – 2017</w:t>
       </w:r>
     </w:p>
     <w:p>
@@ -310,7 +277,13 @@
         </w:numPr>
       </w:pPr>
       <w:r>
-        <w:t xml:space="preserve">Designed a responsive portfolio website using React and Tailwind CSS.</w:t>
+        <w:t xml:space="preserve">Application Support:</w:t>
+      </w:r>
+      <w:r>
+        <w:t xml:space="preserve"> </w:t>
+      </w:r>
+      <w:r>
+        <w:t xml:space="preserve">Assisted in developing and maintaining Python scripts for data analysis and internal tool automation.</w:t>
       </w:r>
     </w:p>
     <w:p>
@@ -322,34 +295,13 @@
         </w:numPr>
       </w:pPr>
       <w:r>
-        <w:t xml:space="preserve">Added admin dashboard for gallery management and pagination, improving content management efficiency.</w:t>
-      </w:r>
-    </w:p>
-    <w:bookmarkEnd w:id="16"/>
-    <w:bookmarkEnd w:id="17"/>
-    <w:bookmarkStart w:id="18" w:name="internship-experience"/>
-    <w:p>
-      <w:pPr>
-        <w:pStyle w:val="Heading2"/>
-      </w:pPr>
-      <w:r>
-        <w:t xml:space="preserve">INTERNSHIP EXPERIENCE</w:t>
-      </w:r>
-    </w:p>
-    <w:p>
-      <w:pPr>
-        <w:pStyle w:val="FirstParagraph"/>
-      </w:pPr>
-      <w:r>
-        <w:t xml:space="preserve">Web Development Intern – ABC Tech Pvt. Ltd.</w:t>
-      </w:r>
-    </w:p>
-    <w:p>
-      <w:pPr>
-        <w:pStyle w:val="BodyText"/>
-      </w:pPr>
-      <w:r>
-        <w:t xml:space="preserve">Jan 2023 – May 2023</w:t>
+        <w:t xml:space="preserve">Bug Resolution:</w:t>
+      </w:r>
+      <w:r>
+        <w:t xml:space="preserve"> </w:t>
+      </w:r>
+      <w:r>
+        <w:t xml:space="preserve">Identified and resolved software defects in existing Python applications, ensuring system stability and improving user satisfaction.</w:t>
       </w:r>
     </w:p>
     <w:p>
@@ -357,67 +309,17 @@
         <w:pStyle w:val="Compact"/>
         <w:numPr>
           <w:ilvl w:val="0"/>
-          <w:numId w:val="1004"/>
+          <w:numId w:val="1003"/>
         </w:numPr>
       </w:pPr>
       <w:r>
-        <w:t xml:space="preserve">Assisted in front-end development for multiple client projects.</w:t>
-      </w:r>
-    </w:p>
-    <w:p>
-      <w:pPr>
-        <w:pStyle w:val="Compact"/>
-        <w:numPr>
-          <w:ilvl w:val="0"/>
-          <w:numId w:val="1004"/>
-        </w:numPr>
-      </w:pPr>
-      <w:r>
-        <w:t xml:space="preserve">Diagnosed and resolved performance bottlenecks, significantly improving website UI and optimization.</w:t>
-      </w:r>
-    </w:p>
-    <w:bookmarkEnd w:id="18"/>
-    <w:bookmarkStart w:id="19" w:name="achievements"/>
-    <w:p>
-      <w:pPr>
-        <w:pStyle w:val="Heading2"/>
-      </w:pPr>
-      <w:r>
-        <w:t xml:space="preserve">ACHIEVEMENTS</w:t>
-      </w:r>
-    </w:p>
-    <w:p>
-      <w:pPr>
-        <w:pStyle w:val="Compact"/>
-        <w:numPr>
-          <w:ilvl w:val="0"/>
-          <w:numId w:val="1005"/>
-        </w:numPr>
-      </w:pPr>
-      <w:r>
-        <w:t xml:space="preserve">Completed Frontend Development with React certification (Coursera).</w:t>
-      </w:r>
-    </w:p>
-    <w:p>
-      <w:pPr>
-        <w:pStyle w:val="Compact"/>
-        <w:numPr>
-          <w:ilvl w:val="0"/>
-          <w:numId w:val="1005"/>
-        </w:numPr>
-      </w:pPr>
-      <w:r>
-        <w:t xml:space="preserve">Led a team to develop an AI-powered project, winning Hackathon 2022, showcasing strong leadership and problem-solving capabilities.</w:t>
-      </w:r>
-    </w:p>
-    <w:bookmarkEnd w:id="19"/>
-    <w:bookmarkStart w:id="20" w:name="hobbies-interests"/>
-    <w:p>
-      <w:pPr>
-        <w:pStyle w:val="Heading2"/>
-      </w:pPr>
-      <w:r>
-        <w:t xml:space="preserve">HOBBIES &amp; INTERESTS</w:t>
+        <w:t xml:space="preserve">Code Review:</w:t>
+      </w:r>
+      <w:r>
+        <w:t xml:space="preserve"> </w:t>
+      </w:r>
+      <w:r>
+        <w:t xml:space="preserve">Actively participated in code reviews, contributing to improved code quality and adherence to best practices for Python development.</w:t>
       </w:r>
     </w:p>
     <w:p>
@@ -425,11 +327,109 @@
         <w:pStyle w:val="FirstParagraph"/>
       </w:pPr>
       <w:r>
-        <w:t xml:space="preserve">Photography &amp; Video Editing, Football, Travelling</w:t>
-      </w:r>
-    </w:p>
-    <w:bookmarkEnd w:id="20"/>
-    <w:bookmarkEnd w:id="21"/>
+        <w:t xml:space="preserve">EDUCATION</w:t>
+      </w:r>
+    </w:p>
+    <w:p>
+      <w:pPr>
+        <w:pStyle w:val="BodyText"/>
+      </w:pPr>
+      <w:r>
+        <w:t xml:space="preserve">University of California, Berkeley</w:t>
+      </w:r>
+      <w:r>
+        <w:t xml:space="preserve"> </w:t>
+      </w:r>
+      <w:r>
+        <w:t xml:space="preserve">2011 – 2015</w:t>
+      </w:r>
+    </w:p>
+    <w:p>
+      <w:pPr>
+        <w:pStyle w:val="BodyText"/>
+      </w:pPr>
+      <w:r>
+        <w:t xml:space="preserve">Bachelor of Science in Computer Science</w:t>
+      </w:r>
+    </w:p>
+    <w:p>
+      <w:pPr>
+        <w:pStyle w:val="BodyText"/>
+      </w:pPr>
+      <w:r>
+        <w:t xml:space="preserve">SKILLS</w:t>
+      </w:r>
+    </w:p>
+    <w:p>
+      <w:pPr>
+        <w:pStyle w:val="BodyText"/>
+      </w:pPr>
+      <w:r>
+        <w:t xml:space="preserve">Programming Languages:</w:t>
+      </w:r>
+      <w:r>
+        <w:t xml:space="preserve"> </w:t>
+      </w:r>
+      <w:r>
+        <w:t xml:space="preserve">Python (Advanced), JavaScript, SQL, Bash</w:t>
+      </w:r>
+    </w:p>
+    <w:p>
+      <w:pPr>
+        <w:pStyle w:val="BodyText"/>
+      </w:pPr>
+      <w:r>
+        <w:t xml:space="preserve">Frameworks &amp; Libraries:</w:t>
+      </w:r>
+      <w:r>
+        <w:t xml:space="preserve"> </w:t>
+      </w:r>
+      <w:r>
+        <w:t xml:space="preserve">Django, Flask, FastAPI, NumPy, Pandas, Scikit-learn, React.js, Express.js</w:t>
+      </w:r>
+    </w:p>
+    <w:p>
+      <w:pPr>
+        <w:pStyle w:val="BodyText"/>
+      </w:pPr>
+      <w:r>
+        <w:t xml:space="preserve">Databases:</w:t>
+      </w:r>
+      <w:r>
+        <w:t xml:space="preserve"> </w:t>
+      </w:r>
+      <w:r>
+        <w:t xml:space="preserve">PostgreSQL, MySQL, MongoDB, Redis</w:t>
+      </w:r>
+    </w:p>
+    <w:p>
+      <w:pPr>
+        <w:pStyle w:val="BodyText"/>
+      </w:pPr>
+      <w:r>
+        <w:t xml:space="preserve">Tools &amp; Platforms:</w:t>
+      </w:r>
+      <w:r>
+        <w:t xml:space="preserve"> </w:t>
+      </w:r>
+      <w:r>
+        <w:t xml:space="preserve">Git, Docker, Kubernetes, AWS, Azure, Jira, Postman, Jenkins</w:t>
+      </w:r>
+    </w:p>
+    <w:p>
+      <w:pPr>
+        <w:pStyle w:val="BodyText"/>
+      </w:pPr>
+      <w:r>
+        <w:t xml:space="preserve">Methodologies:</w:t>
+      </w:r>
+      <w:r>
+        <w:t xml:space="preserve"> </w:t>
+      </w:r>
+      <w:r>
+        <w:t xml:space="preserve">Agile, Scrum, TDD, CI/CD, OOP</w:t>
+      </w:r>
+    </w:p>
     <w:sectPr>
       <w:footnotePr>
         <w:numRestart w:val="eachSect"/>
@@ -655,12 +655,6 @@
   <w:num w:numId="1003">
     <w:abstractNumId w:val="991"/>
   </w:num>
-  <w:num w:numId="1004">
-    <w:abstractNumId w:val="991"/>
-  </w:num>
-  <w:num w:numId="1005">
-    <w:abstractNumId w:val="991"/>
-  </w:num>
 </w:numbering>
 </file>
 
@@ -672,7 +666,7 @@
         <w:rFonts w:asciiTheme="minorHAnsi" w:cstheme="minorBidi" w:eastAsiaTheme="minorEastAsia" w:hAnsiTheme="minorHAnsi"/>
         <w:sz w:val="24"/>
         <w:szCs w:val="24"/>
-        <w:lang w:bidi="ar-SA" w:eastAsia="zh-CN" w:val="en-US"/>
+        <w:lang w:bidi="ar-SA" w:eastAsia="zh-CN" w:val="en"/>
       </w:rPr>
     </w:rPrDefault>
     <w:pPrDefault>

</xml_diff>